<commit_message>
edited added a new line
</commit_message>
<xml_diff>
--- a/Shashi.docx
+++ b/Shashi.docx
@@ -10,6 +10,11 @@
     <w:p>
       <w:r>
         <w:t>Shashi Preetham Devisetty</w:t>
+      </w:r>
+    </w:p>
+    <w:p>
+      <w:r>
+        <w:t>hi</w:t>
       </w:r>
     </w:p>
     <w:sectPr>

</xml_diff>

<commit_message>
first commit to branch
</commit_message>
<xml_diff>
--- a/Shashi.docx
+++ b/Shashi.docx
@@ -13,6 +13,7 @@
       </w:r>
     </w:p>
     <w:p>
+      <w:proofErr w:type="gramStart"/>
       <w:r>
         <w:t>H</w:t>
       </w:r>
@@ -27,12 +28,20 @@
         <w:t>i</w:t>
       </w:r>
       <w:proofErr w:type="spellEnd"/>
+      <w:proofErr w:type="gramEnd"/>
     </w:p>
     <w:p>
       <w:r>
         <w:t xml:space="preserve">am editing </w:t>
       </w:r>
     </w:p>
+    <w:p/>
+    <w:p>
+      <w:r>
+        <w:t>I am adding it to my branch</w:t>
+      </w:r>
+    </w:p>
+    <w:p/>
     <w:sectPr>
       <w:pgSz w:w="11906" w:h="16838"/>
       <w:pgMar w:top="1440" w:right="1440" w:bottom="1440" w:left="1440" w:header="708" w:footer="708" w:gutter="0"/>

</xml_diff>